<commit_message>
Handbook: remove metadata from module descriptor and handbook
Document properties, sensitivity-label properties, document-management data and leftover internal parts removed from the .docx; document information and XMP metadata removed from the PDF. Visible content unchanged.

Co-Authored-By: Claude Opus 5.5 <noreply@anthropic.com>
Claude-Session: https://claude.ai/code/session_016QoftaZqkx8BNCkcoCQVn5

[skip ci]
</commit_message>
<xml_diff>
--- a/content/Handbook/5CM522 Module Descriptor (approved May 2024).docx
+++ b/content/Handbook/5CM522 Module Descriptor (approved May 2024).docx
@@ -5757,360 +5757,4 @@
   <a:objectDefaults/>
   <a:extraClrSchemeLst/>
 </a:theme>
-</file>
-
-<file path=customXml/item1.xml><?xml version="1.0" encoding="utf-8"?>
-<p:properties xmlns:p="http://schemas.microsoft.com/office/2006/metadata/properties" xmlns:xsi="http://www.w3.org/2001/XMLSchema-instance" xmlns:pc="http://schemas.microsoft.com/office/infopath/2007/PartnerControls">
-  <documentManagement>
-    <DocumentType xmlns="c8a7d3bd-4294-4888-b0e5-5c52bb8b4307">Module Specification</DocumentType>
-    <Departments xmlns="c8a7d3bd-4294-4888-b0e5-5c52bb8b4307">Electronics, Computing and Mathematics</Departments>
-    <_dlc_DocIdPersistId xmlns="c8a7d3bd-4294-4888-b0e5-5c52bb8b4307" xsi:nil="true"/>
-    <Effective xmlns="c8a7d3bd-4294-4888-b0e5-5c52bb8b4307">25/26</Effective>
-    <_dlc_DocId xmlns="c8a7d3bd-4294-4888-b0e5-5c52bb8b4307">NFVP76K36W22-1537566322-576</_dlc_DocId>
-    <_dlc_DocIdUrl xmlns="c8a7d3bd-4294-4888-b0e5-5c52bb8b4307">
-      <Url>https://unimailderbyac.sharepoint.com/sites/quality/repository/_layouts/15/DocIdRedir.aspx?ID=NFVP76K36W22-1537566322-576</Url>
-      <Description>NFVP76K36W22-1537566322-576</Description>
-    </_dlc_DocIdUrl>
-  </documentManagement>
-</p:properties>
-</file>
-
-<file path=customXml/item2.xml><?xml version="1.0" encoding="utf-8"?>
-<ct:contentTypeSchema xmlns:ct="http://schemas.microsoft.com/office/2006/metadata/contentType" xmlns:ma="http://schemas.microsoft.com/office/2006/metadata/properties/metaAttributes" ct:_="" ma:_="" ma:contentTypeName="Document" ma:contentTypeID="0x010100BA4EB0AFF1571B40A613013DD79692A4" ma:contentTypeVersion="27" ma:contentTypeDescription="Create a new document." ma:contentTypeScope="" ma:versionID="7b1304db83ec0178313e5a840ce46994">
-  <xsd:schema xmlns:xsd="http://www.w3.org/2001/XMLSchema" xmlns:xs="http://www.w3.org/2001/XMLSchema" xmlns:p="http://schemas.microsoft.com/office/2006/metadata/properties" xmlns:ns2="c8a7d3bd-4294-4888-b0e5-5c52bb8b4307" xmlns:ns3="b3229695-8731-47a4-8d81-8bcad47895c2" targetNamespace="http://schemas.microsoft.com/office/2006/metadata/properties" ma:root="true" ma:fieldsID="ff583d14dd47666d60347e0ab75e6263" ns2:_="" ns3:_="">
-    <xsd:import namespace="c8a7d3bd-4294-4888-b0e5-5c52bb8b4307"/>
-    <xsd:import namespace="b3229695-8731-47a4-8d81-8bcad47895c2"/>
-    <xsd:element name="properties">
-      <xsd:complexType>
-        <xsd:sequence>
-          <xsd:element name="documentManagement">
-            <xsd:complexType>
-              <xsd:all>
-                <xsd:element ref="ns2:_dlc_DocId" minOccurs="0"/>
-                <xsd:element ref="ns2:_dlc_DocIdUrl" minOccurs="0"/>
-                <xsd:element ref="ns2:_dlc_DocIdPersistId" minOccurs="0"/>
-                <xsd:element ref="ns2:Departments"/>
-                <xsd:element ref="ns2:DocumentType"/>
-                <xsd:element ref="ns2:Effective"/>
-                <xsd:element ref="ns3:MediaServiceMetadata" minOccurs="0"/>
-                <xsd:element ref="ns3:MediaServiceFastMetadata" minOccurs="0"/>
-                <xsd:element ref="ns3:MediaServiceAutoKeyPoints" minOccurs="0"/>
-                <xsd:element ref="ns3:MediaServiceKeyPoints" minOccurs="0"/>
-                <xsd:element ref="ns3:MediaServiceObjectDetectorVersions" minOccurs="0"/>
-                <xsd:element ref="ns3:MediaServiceSearchProperties" minOccurs="0"/>
-              </xsd:all>
-            </xsd:complexType>
-          </xsd:element>
-        </xsd:sequence>
-      </xsd:complexType>
-    </xsd:element>
-  </xsd:schema>
-  <xsd:schema xmlns:xsd="http://www.w3.org/2001/XMLSchema" xmlns:xs="http://www.w3.org/2001/XMLSchema" xmlns:dms="http://schemas.microsoft.com/office/2006/documentManagement/types" xmlns:pc="http://schemas.microsoft.com/office/infopath/2007/PartnerControls" targetNamespace="c8a7d3bd-4294-4888-b0e5-5c52bb8b4307" elementFormDefault="qualified">
-    <xsd:import namespace="http://schemas.microsoft.com/office/2006/documentManagement/types"/>
-    <xsd:import namespace="http://schemas.microsoft.com/office/infopath/2007/PartnerControls"/>
-    <xsd:element name="_dlc_DocId" ma:index="8" nillable="true" ma:displayName="Document ID Value" ma:description="The value of the document ID assigned to this item." ma:internalName="_dlc_DocId" ma:readOnly="true">
-      <xsd:simpleType>
-        <xsd:restriction base="dms:Text"/>
-      </xsd:simpleType>
-    </xsd:element>
-    <xsd:element name="_dlc_DocIdUrl" ma:index="9" nillable="true" ma:displayName="Document ID" ma:description="Permanent link to this document." ma:hidden="true" ma:internalName="_dlc_DocIdUrl" ma:readOnly="true">
-      <xsd:complexType>
-        <xsd:complexContent>
-          <xsd:extension base="dms:URL">
-            <xsd:sequence>
-              <xsd:element name="Url" type="dms:ValidUrl" minOccurs="0" nillable="true"/>
-              <xsd:element name="Description" type="xsd:string" nillable="true"/>
-            </xsd:sequence>
-          </xsd:extension>
-        </xsd:complexContent>
-      </xsd:complexType>
-    </xsd:element>
-    <xsd:element name="_dlc_DocIdPersistId" ma:index="10" nillable="true" ma:displayName="Persist ID" ma:description="Keep ID on add." ma:hidden="true" ma:internalName="_dlc_DocIdPersistId" ma:readOnly="false">
-      <xsd:simpleType>
-        <xsd:restriction base="dms:Boolean"/>
-      </xsd:simpleType>
-    </xsd:element>
-    <xsd:element name="Departments" ma:index="11" ma:displayName="Departments" ma:format="RadioButtons" ma:internalName="Departments" ma:readOnly="false">
-      <xsd:simpleType>
-        <xsd:restriction base="dms:Choice">
-          <xsd:enumeration value="Art and Design"/>
-          <xsd:enumeration value="Media and Performing Arts"/>
-          <xsd:enumeration value="Derby Management School"/>
-          <xsd:enumeration value="Derby Business School"/>
-          <xsd:enumeration value="Hotel, Resort and Spa Management"/>
-          <xsd:enumeration value="Education and Childhood"/>
-          <xsd:enumeration value="Postgraduate and Initial Teacher Education"/>
-          <xsd:enumeration value="Electronics, Computing and Mathematics"/>
-          <xsd:enumeration value="Mechanical Engineering and the Built Environment"/>
-          <xsd:enumeration value="Health Care Practice"/>
-          <xsd:enumeration value="Social and Community Studies"/>
-          <xsd:enumeration value="Therapeutic Practice"/>
-          <xsd:enumeration value="Humanities"/>
-          <xsd:enumeration value="Derby Law School"/>
-          <xsd:enumeration value="Social Sciences"/>
-          <xsd:enumeration value="Life Sciences"/>
-          <xsd:enumeration value="Natural Sciences"/>
-          <xsd:enumeration value="UDOL"/>
-          <xsd:enumeration value="Mineral Products"/>
-          <xsd:enumeration value="Not Applicable"/>
-        </xsd:restriction>
-      </xsd:simpleType>
-    </xsd:element>
-    <xsd:element name="DocumentType" ma:index="12" ma:displayName="Document Type" ma:format="RadioButtons" ma:internalName="DocumentType" ma:readOnly="false">
-      <xsd:simpleType>
-        <xsd:restriction base="dms:Choice">
-          <xsd:enumeration value="Module Specification"/>
-          <xsd:enumeration value="Programme Specification"/>
-          <xsd:enumeration value="Scheme Specification"/>
-          <xsd:enumeration value="Matrix"/>
-        </xsd:restriction>
-      </xsd:simpleType>
-    </xsd:element>
-    <xsd:element name="Effective" ma:index="13" ma:displayName="Effective" ma:default="21/22" ma:format="Dropdown" ma:internalName="Effective" ma:readOnly="false">
-      <xsd:simpleType>
-        <xsd:restriction base="dms:Choice">
-          <xsd:enumeration value="08/09"/>
-          <xsd:enumeration value="09/10"/>
-          <xsd:enumeration value="10/11"/>
-          <xsd:enumeration value="11/12"/>
-          <xsd:enumeration value="12/13"/>
-          <xsd:enumeration value="13/14"/>
-          <xsd:enumeration value="14/15"/>
-          <xsd:enumeration value="15/16"/>
-          <xsd:enumeration value="16/17"/>
-          <xsd:enumeration value="17/18"/>
-          <xsd:enumeration value="18/19"/>
-          <xsd:enumeration value="19/20"/>
-          <xsd:enumeration value="20/21"/>
-          <xsd:enumeration value="21/22"/>
-          <xsd:enumeration value="22/23"/>
-          <xsd:enumeration value="23/24"/>
-          <xsd:enumeration value="24/25"/>
-          <xsd:enumeration value="25/26"/>
-          <xsd:enumeration value="26/27"/>
-        </xsd:restriction>
-      </xsd:simpleType>
-    </xsd:element>
-  </xsd:schema>
-  <xsd:schema xmlns:xsd="http://www.w3.org/2001/XMLSchema" xmlns:xs="http://www.w3.org/2001/XMLSchema" xmlns:dms="http://schemas.microsoft.com/office/2006/documentManagement/types" xmlns:pc="http://schemas.microsoft.com/office/infopath/2007/PartnerControls" targetNamespace="b3229695-8731-47a4-8d81-8bcad47895c2" elementFormDefault="qualified">
-    <xsd:import namespace="http://schemas.microsoft.com/office/2006/documentManagement/types"/>
-    <xsd:import namespace="http://schemas.microsoft.com/office/infopath/2007/PartnerControls"/>
-    <xsd:element name="MediaServiceMetadata" ma:index="14" nillable="true" ma:displayName="MediaServiceMetadata" ma:hidden="true" ma:internalName="MediaServiceMetadata" ma:readOnly="true">
-      <xsd:simpleType>
-        <xsd:restriction base="dms:Note"/>
-      </xsd:simpleType>
-    </xsd:element>
-    <xsd:element name="MediaServiceFastMetadata" ma:index="15" nillable="true" ma:displayName="MediaServiceFastMetadata" ma:hidden="true" ma:internalName="MediaServiceFastMetadata" ma:readOnly="true">
-      <xsd:simpleType>
-        <xsd:restriction base="dms:Note"/>
-      </xsd:simpleType>
-    </xsd:element>
-    <xsd:element name="MediaServiceAutoKeyPoints" ma:index="16" nillable="true" ma:displayName="MediaServiceAutoKeyPoints" ma:hidden="true" ma:internalName="MediaServiceAutoKeyPoints" ma:readOnly="true">
-      <xsd:simpleType>
-        <xsd:restriction base="dms:Note"/>
-      </xsd:simpleType>
-    </xsd:element>
-    <xsd:element name="MediaServiceKeyPoints" ma:index="17" nillable="true" ma:displayName="KeyPoints" ma:internalName="MediaServiceKeyPoints" ma:readOnly="true">
-      <xsd:simpleType>
-        <xsd:restriction base="dms:Note">
-          <xsd:maxLength value="255"/>
-        </xsd:restriction>
-      </xsd:simpleType>
-    </xsd:element>
-    <xsd:element name="MediaServiceObjectDetectorVersions" ma:index="18" nillable="true" ma:displayName="MediaServiceObjectDetectorVersions" ma:hidden="true" ma:indexed="true" ma:internalName="MediaServiceObjectDetectorVersions" ma:readOnly="true">
-      <xsd:simpleType>
-        <xsd:restriction base="dms:Text"/>
-      </xsd:simpleType>
-    </xsd:element>
-    <xsd:element name="MediaServiceSearchProperties" ma:index="19" nillable="true" ma:displayName="MediaServiceSearchProperties" ma:hidden="true" ma:internalName="MediaServiceSearchProperties" ma:readOnly="true">
-      <xsd:simpleType>
-        <xsd:restriction base="dms:Note"/>
-      </xsd:simpleType>
-    </xsd:element>
-  </xsd:schema>
-  <xsd:schema xmlns="http://schemas.openxmlformats.org/package/2006/metadata/core-properties" xmlns:xsd="http://www.w3.org/2001/XMLSchema" xmlns:xsi="http://www.w3.org/2001/XMLSchema-instance" xmlns:dc="http://purl.org/dc/elements/1.1/" xmlns:dcterms="http://purl.org/dc/terms/" xmlns:odoc="http://schemas.microsoft.com/internal/obd" targetNamespace="http://schemas.openxmlformats.org/package/2006/metadata/core-properties" elementFormDefault="qualified" attributeFormDefault="unqualified" blockDefault="#all">
-    <xsd:import namespace="http://purl.org/dc/elements/1.1/" schemaLocation="http://dublincore.org/schemas/xmls/qdc/2003/04/02/dc.xsd"/>
-    <xsd:import namespace="http://purl.org/dc/terms/" schemaLocation="http://dublincore.org/schemas/xmls/qdc/2003/04/02/dcterms.xsd"/>
-    <xsd:element name="coreProperties" type="CT_coreProperties"/>
-    <xsd:complexType name="CT_coreProperties">
-      <xsd:all>
-        <xsd:element ref="dc:creator" minOccurs="0" maxOccurs="1"/>
-        <xsd:element ref="dcterms:created" minOccurs="0" maxOccurs="1"/>
-        <xsd:element ref="dc:identifier" minOccurs="0" maxOccurs="1"/>
-        <xsd:element name="contentType" minOccurs="0" maxOccurs="1" type="xsd:string" ma:index="0" ma:displayName="Content Type"/>
-        <xsd:element ref="dc:title" minOccurs="0" maxOccurs="1" ma:index="4" ma:displayName="Title"/>
-        <xsd:element ref="dc:subject" minOccurs="0" maxOccurs="1"/>
-        <xsd:element ref="dc:description" minOccurs="0" maxOccurs="1"/>
-        <xsd:element name="keywords" minOccurs="0" maxOccurs="1" type="xsd:string"/>
-        <xsd:element ref="dc:language" minOccurs="0" maxOccurs="1"/>
-        <xsd:element name="category" minOccurs="0" maxOccurs="1" type="xsd:string"/>
-        <xsd:element name="version" minOccurs="0" maxOccurs="1" type="xsd:string"/>
-        <xsd:element name="revision" minOccurs="0" maxOccurs="1" type="xsd:string">
-          <xsd:annotation>
-            <xsd:documentation>
-                        This value indicates the number of saves or revisions. The application is responsible for updating this value after each revision.
-                    </xsd:documentation>
-          </xsd:annotation>
-        </xsd:element>
-        <xsd:element name="lastModifiedBy" minOccurs="0" maxOccurs="1" type="xsd:string"/>
-        <xsd:element ref="dcterms:modified" minOccurs="0" maxOccurs="1"/>
-        <xsd:element name="contentStatus" minOccurs="0" maxOccurs="1" type="xsd:string"/>
-      </xsd:all>
-    </xsd:complexType>
-  </xsd:schema>
-  <xs:schema xmlns:pc="http://schemas.microsoft.com/office/infopath/2007/PartnerControls" xmlns:xs="http://www.w3.org/2001/XMLSchema" targetNamespace="http://schemas.microsoft.com/office/infopath/2007/PartnerControls" elementFormDefault="qualified" attributeFormDefault="unqualified">
-    <xs:element name="Person">
-      <xs:complexType>
-        <xs:sequence>
-          <xs:element ref="pc:DisplayName" minOccurs="0"/>
-          <xs:element ref="pc:AccountId" minOccurs="0"/>
-          <xs:element ref="pc:AccountType" minOccurs="0"/>
-        </xs:sequence>
-      </xs:complexType>
-    </xs:element>
-    <xs:element name="DisplayName" type="xs:string"/>
-    <xs:element name="AccountId" type="xs:string"/>
-    <xs:element name="AccountType" type="xs:string"/>
-    <xs:element name="BDCAssociatedEntity">
-      <xs:complexType>
-        <xs:sequence>
-          <xs:element ref="pc:BDCEntity" minOccurs="0" maxOccurs="unbounded"/>
-        </xs:sequence>
-        <xs:attribute ref="pc:EntityNamespace"/>
-        <xs:attribute ref="pc:EntityName"/>
-        <xs:attribute ref="pc:SystemInstanceName"/>
-        <xs:attribute ref="pc:AssociationName"/>
-      </xs:complexType>
-    </xs:element>
-    <xs:attribute name="EntityNamespace" type="xs:string"/>
-    <xs:attribute name="EntityName" type="xs:string"/>
-    <xs:attribute name="SystemInstanceName" type="xs:string"/>
-    <xs:attribute name="AssociationName" type="xs:string"/>
-    <xs:element name="BDCEntity">
-      <xs:complexType>
-        <xs:sequence>
-          <xs:element ref="pc:EntityDisplayName" minOccurs="0"/>
-          <xs:element ref="pc:EntityInstanceReference" minOccurs="0"/>
-          <xs:element ref="pc:EntityId1" minOccurs="0"/>
-          <xs:element ref="pc:EntityId2" minOccurs="0"/>
-          <xs:element ref="pc:EntityId3" minOccurs="0"/>
-          <xs:element ref="pc:EntityId4" minOccurs="0"/>
-          <xs:element ref="pc:EntityId5" minOccurs="0"/>
-        </xs:sequence>
-      </xs:complexType>
-    </xs:element>
-    <xs:element name="EntityDisplayName" type="xs:string"/>
-    <xs:element name="EntityInstanceReference" type="xs:string"/>
-    <xs:element name="EntityId1" type="xs:string"/>
-    <xs:element name="EntityId2" type="xs:string"/>
-    <xs:element name="EntityId3" type="xs:string"/>
-    <xs:element name="EntityId4" type="xs:string"/>
-    <xs:element name="EntityId5" type="xs:string"/>
-    <xs:element name="Terms">
-      <xs:complexType>
-        <xs:sequence>
-          <xs:element ref="pc:TermInfo" minOccurs="0" maxOccurs="unbounded"/>
-        </xs:sequence>
-      </xs:complexType>
-    </xs:element>
-    <xs:element name="TermInfo">
-      <xs:complexType>
-        <xs:sequence>
-          <xs:element ref="pc:TermName" minOccurs="0"/>
-          <xs:element ref="pc:TermId" minOccurs="0"/>
-        </xs:sequence>
-      </xs:complexType>
-    </xs:element>
-    <xs:element name="TermName" type="xs:string"/>
-    <xs:element name="TermId" type="xs:string"/>
-  </xs:schema>
-</ct:contentTypeSchema>
-</file>
-
-<file path=customXml/item3.xml><?xml version="1.0" encoding="utf-8"?>
-<?mso-contentType ?>
-<FormTemplates xmlns="http://schemas.microsoft.com/sharepoint/v3/contenttype/forms">
-  <Display>DocumentLibraryForm</Display>
-  <Edit>DocumentLibraryForm</Edit>
-  <New>DocumentLibraryForm</New>
-</FormTemplates>
-</file>
-
-<file path=customXml/item4.xml><?xml version="1.0" encoding="utf-8"?>
-<?mso-contentType ?>
-<spe:Receivers xmlns:spe="http://schemas.microsoft.com/sharepoint/events">
-  <Receiver>
-    <Name>Document ID Generator</Name>
-    <Synchronization>Synchronous</Synchronization>
-    <Type>10001</Type>
-    <SequenceNumber>1000</SequenceNumber>
-    <Url/>
-    <Assembly>Microsoft.Office.DocumentManagement, Version=16.0.0.0, Culture=neutral, PublicKeyToken=71e9bce111e9429c</Assembly>
-    <Class>Microsoft.Office.DocumentManagement.Internal.DocIdHandler</Class>
-    <Data/>
-    <Filter/>
-  </Receiver>
-  <Receiver>
-    <Name>Document ID Generator</Name>
-    <Synchronization>Synchronous</Synchronization>
-    <Type>10002</Type>
-    <SequenceNumber>1001</SequenceNumber>
-    <Url/>
-    <Assembly>Microsoft.Office.DocumentManagement, Version=16.0.0.0, Culture=neutral, PublicKeyToken=71e9bce111e9429c</Assembly>
-    <Class>Microsoft.Office.DocumentManagement.Internal.DocIdHandler</Class>
-    <Data/>
-    <Filter/>
-  </Receiver>
-  <Receiver>
-    <Name>Document ID Generator</Name>
-    <Synchronization>Synchronous</Synchronization>
-    <Type>10004</Type>
-    <SequenceNumber>1002</SequenceNumber>
-    <Url/>
-    <Assembly>Microsoft.Office.DocumentManagement, Version=16.0.0.0, Culture=neutral, PublicKeyToken=71e9bce111e9429c</Assembly>
-    <Class>Microsoft.Office.DocumentManagement.Internal.DocIdHandler</Class>
-    <Data/>
-    <Filter/>
-  </Receiver>
-  <Receiver>
-    <Name>Document ID Generator</Name>
-    <Synchronization>Synchronous</Synchronization>
-    <Type>10006</Type>
-    <SequenceNumber>1003</SequenceNumber>
-    <Url/>
-    <Assembly>Microsoft.Office.DocumentManagement, Version=16.0.0.0, Culture=neutral, PublicKeyToken=71e9bce111e9429c</Assembly>
-    <Class>Microsoft.Office.DocumentManagement.Internal.DocIdHandler</Class>
-    <Data/>
-    <Filter/>
-  </Receiver>
-</spe:Receivers>
-</file>
-
-<file path=customXml/itemProps1.xml><?xml version="1.0" encoding="utf-8"?>
-<ds:datastoreItem xmlns:ds="http://schemas.openxmlformats.org/officeDocument/2006/customXml" ds:itemID="{17E6291C-96D2-41FD-B066-954D451A46DA}">
-  <ds:schemaRefs>
-    <ds:schemaRef ds:uri="http://schemas.microsoft.com/office/2006/metadata/properties"/>
-    <ds:schemaRef ds:uri="http://schemas.microsoft.com/office/infopath/2007/PartnerControls"/>
-    <ds:schemaRef ds:uri="504ab15f-8616-4118-abd3-d3fdbf3493bb"/>
-    <ds:schemaRef ds:uri="c8a7d3bd-4294-4888-b0e5-5c52bb8b4307"/>
-    <ds:schemaRef ds:uri="123a8cc3-15a6-4e5d-8bfc-4324b6df0e7e"/>
-    <ds:schemaRef ds:uri="a49a4d2a-14f7-41da-a7cb-3e6117ed73ad"/>
-  </ds:schemaRefs>
-</ds:datastoreItem>
-</file>
-
-<file path=customXml/itemProps2.xml><?xml version="1.0" encoding="utf-8"?>
-<ds:datastoreItem xmlns:ds="http://schemas.openxmlformats.org/officeDocument/2006/customXml" ds:itemID="{0DD0AEA4-9DA0-4FC6-AFD6-F7247168E52A}"/>
-</file>
-
-<file path=customXml/itemProps3.xml><?xml version="1.0" encoding="utf-8"?>
-<ds:datastoreItem xmlns:ds="http://schemas.openxmlformats.org/officeDocument/2006/customXml" ds:itemID="{91DF739A-5406-4816-8377-4688DD6A4DD1}">
-  <ds:schemaRefs>
-    <ds:schemaRef ds:uri="http://schemas.microsoft.com/sharepoint/v3/contenttype/forms"/>
-  </ds:schemaRefs>
-</ds:datastoreItem>
-</file>
-
-<file path=customXml/itemProps4.xml><?xml version="1.0" encoding="utf-8"?>
-<ds:datastoreItem xmlns:ds="http://schemas.openxmlformats.org/officeDocument/2006/customXml" ds:itemID="{FB4A40ED-5D24-493A-A6EC-276D481BFFA3}"/>
 </file>
</xml_diff>